<commit_message>
Add Chat Safeguarding Policy and enhance role definitions
- Introduced a new Chat Safeguarding Policy document (CHAT_SAFEGUARDING_POLICY_V1.md) outlining standards for chat usage, particularly for protecting minors.
- Updated ROLES_AND_POSITIONS.md to include the new Safeguarding Admin role with specific responsibilities and access levels.
- Enhanced SERVICE_REGISTRY.md with details on new services: ai_service (port 8011), pools_service (port 8014), reporting_service (port 8015), and planned chat_service (port 8016).
- Clarified the deprecated status of identity_service and updated service communication flow.
</commit_message>
<xml_diff>
--- a/docs/marketing/swimbuddz_content_templates.docx
+++ b/docs/marketing/swimbuddz_content_templates.docx
@@ -3384,6 +3384,818 @@
         </w:tc>
       </w:tr>
     </w:tbl>
+    <w:p>
+      <w:pPr>
+        <w:spacing w:after="80"/>
+      </w:pPr>
+    </w:p>
+    <w:p>
+      <w:pPr>
+        <w:spacing w:after="120"/>
+      </w:pPr>
+      <w:r>
+        <w:rPr>
+          <w:rFonts w:ascii="Arial" w:cs="Arial" w:eastAsia="Arial" w:hAnsi="Arial"/>
+          <w:b/>
+          <w:bCs/>
+          <w:sz w:val="22"/>
+          <w:szCs w:val="22"/>
+        </w:rPr>
+        <w:t xml:space="preserve">One-liner formulas (for the “Meet [Name] — [one-liner]” hook)</w:t>
+      </w:r>
+    </w:p>
+    <w:p>
+      <w:pPr>
+        <w:spacing w:after="120"/>
+      </w:pPr>
+      <w:r>
+        <w:rPr>
+          <w:rFonts w:ascii="Arial" w:cs="Arial" w:eastAsia="Arial" w:hAnsi="Arial"/>
+          <w:sz w:val="22"/>
+          <w:szCs w:val="22"/>
+        </w:rPr>
+        <w:t xml:space="preserve">The one-liner isn’t random — it’s sourced from the weekly Member Spotlight in the Content WhatsApp group, then distilled through one of the formulas below. Use this when writing the Cover slide of a Member Spotlight carousel, or the caption hook for any Spotlight post.</w:t>
+      </w:r>
+    </w:p>
+    <w:tbl>
+      <w:tblPr>
+        <w:tblW w:type="dxa" w:w="9360"/>
+        <w:tblBorders>
+          <w:top w:val="single" w:color="auto" w:sz="4"/>
+          <w:left w:val="single" w:color="auto" w:sz="4"/>
+          <w:bottom w:val="single" w:color="auto" w:sz="4"/>
+          <w:right w:val="single" w:color="auto" w:sz="4"/>
+          <w:insideH w:val="single" w:color="auto" w:sz="4"/>
+          <w:insideV w:val="single" w:color="auto" w:sz="4"/>
+        </w:tblBorders>
+      </w:tblPr>
+      <w:tblGrid>
+        <w:gridCol w:w="3120"/>
+        <w:gridCol w:w="2760"/>
+        <w:gridCol w:w="3480"/>
+      </w:tblGrid>
+      <w:tr>
+        <w:tc>
+          <w:tcPr>
+            <w:tcW w:type="dxa" w:w="3120"/>
+            <w:tcBorders>
+              <w:top w:val="single" w:color="CCCCCC" w:sz="1"/>
+              <w:left w:val="single" w:color="CCCCCC" w:sz="1"/>
+              <w:bottom w:val="single" w:color="CCCCCC" w:sz="1"/>
+              <w:right w:val="single" w:color="CCCCCC" w:sz="1"/>
+            </w:tcBorders>
+            <w:shd w:fill="1B2A4A" w:val="clear"/>
+            <w:tcMar>
+              <w:top w:type="dxa" w:w="80"/>
+              <w:left w:type="dxa" w:w="120"/>
+              <w:bottom w:type="dxa" w:w="80"/>
+              <w:right w:type="dxa" w:w="120"/>
+            </w:tcMar>
+          </w:tcPr>
+          <w:p>
+            <w:r>
+              <w:rPr>
+                <w:rFonts w:ascii="Arial" w:cs="Arial" w:eastAsia="Arial" w:hAnsi="Arial"/>
+                <w:b/>
+                <w:bCs/>
+                <w:color w:val="FFFFFF"/>
+                <w:sz w:val="20"/>
+                <w:szCs w:val="20"/>
+              </w:rPr>
+              <w:t xml:space="preserve">Formula</w:t>
+            </w:r>
+          </w:p>
+        </w:tc>
+        <w:tc>
+          <w:tcPr>
+            <w:tcW w:type="dxa" w:w="2760"/>
+            <w:tcBorders>
+              <w:top w:val="single" w:color="CCCCCC" w:sz="1"/>
+              <w:left w:val="single" w:color="CCCCCC" w:sz="1"/>
+              <w:bottom w:val="single" w:color="CCCCCC" w:sz="1"/>
+              <w:right w:val="single" w:color="CCCCCC" w:sz="1"/>
+            </w:tcBorders>
+            <w:shd w:fill="1B2A4A" w:val="clear"/>
+            <w:tcMar>
+              <w:top w:type="dxa" w:w="80"/>
+              <w:left w:type="dxa" w:w="120"/>
+              <w:bottom w:type="dxa" w:w="80"/>
+              <w:right w:type="dxa" w:w="120"/>
+            </w:tcMar>
+          </w:tcPr>
+          <w:p>
+            <w:r>
+              <w:rPr>
+                <w:rFonts w:ascii="Arial" w:cs="Arial" w:eastAsia="Arial" w:hAnsi="Arial"/>
+                <w:b/>
+                <w:bCs/>
+                <w:color w:val="FFFFFF"/>
+                <w:sz w:val="20"/>
+                <w:szCs w:val="20"/>
+              </w:rPr>
+              <w:t xml:space="preserve">When to use</w:t>
+            </w:r>
+          </w:p>
+        </w:tc>
+        <w:tc>
+          <w:tcPr>
+            <w:tcW w:type="dxa" w:w="3480"/>
+            <w:tcBorders>
+              <w:top w:val="single" w:color="CCCCCC" w:sz="1"/>
+              <w:left w:val="single" w:color="CCCCCC" w:sz="1"/>
+              <w:bottom w:val="single" w:color="CCCCCC" w:sz="1"/>
+              <w:right w:val="single" w:color="CCCCCC" w:sz="1"/>
+            </w:tcBorders>
+            <w:shd w:fill="1B2A4A" w:val="clear"/>
+            <w:tcMar>
+              <w:top w:type="dxa" w:w="80"/>
+              <w:left w:type="dxa" w:w="120"/>
+              <w:bottom w:type="dxa" w:w="80"/>
+              <w:right w:type="dxa" w:w="120"/>
+            </w:tcMar>
+          </w:tcPr>
+          <w:p>
+            <w:r>
+              <w:rPr>
+                <w:rFonts w:ascii="Arial" w:cs="Arial" w:eastAsia="Arial" w:hAnsi="Arial"/>
+                <w:b/>
+                <w:bCs/>
+                <w:color w:val="FFFFFF"/>
+                <w:sz w:val="20"/>
+                <w:szCs w:val="20"/>
+              </w:rPr>
+              <w:t xml:space="preserve">Example</w:t>
+            </w:r>
+          </w:p>
+        </w:tc>
+      </w:tr>
+      <w:tr>
+        <w:tc>
+          <w:tcPr>
+            <w:tcW w:type="dxa" w:w="3120"/>
+            <w:tcBorders>
+              <w:top w:val="single" w:color="CCCCCC" w:sz="1"/>
+              <w:left w:val="single" w:color="CCCCCC" w:sz="1"/>
+              <w:bottom w:val="single" w:color="CCCCCC" w:sz="1"/>
+              <w:right w:val="single" w:color="CCCCCC" w:sz="1"/>
+            </w:tcBorders>
+            <w:tcMar>
+              <w:top w:type="dxa" w:w="80"/>
+              <w:left w:type="dxa" w:w="120"/>
+              <w:bottom w:type="dxa" w:w="80"/>
+              <w:right w:type="dxa" w:w="120"/>
+            </w:tcMar>
+          </w:tcPr>
+          <w:p>
+            <w:r>
+              <w:rPr>
+                <w:rFonts w:ascii="Arial" w:cs="Arial" w:eastAsia="Arial" w:hAnsi="Arial"/>
+                <w:b/>
+                <w:bCs/>
+                <w:color w:val="000000"/>
+                <w:sz w:val="20"/>
+                <w:szCs w:val="20"/>
+              </w:rPr>
+              <w:t xml:space="preserve">“The one who [memorable trait or past fear]”</w:t>
+            </w:r>
+          </w:p>
+        </w:tc>
+        <w:tc>
+          <w:tcPr>
+            <w:tcW w:type="dxa" w:w="2760"/>
+            <w:tcBorders>
+              <w:top w:val="single" w:color="CCCCCC" w:sz="1"/>
+              <w:left w:val="single" w:color="CCCCCC" w:sz="1"/>
+              <w:bottom w:val="single" w:color="CCCCCC" w:sz="1"/>
+              <w:right w:val="single" w:color="CCCCCC" w:sz="1"/>
+            </w:tcBorders>
+            <w:tcMar>
+              <w:top w:type="dxa" w:w="80"/>
+              <w:left w:type="dxa" w:w="120"/>
+              <w:bottom w:type="dxa" w:w="80"/>
+              <w:right w:type="dxa" w:w="120"/>
+            </w:tcMar>
+          </w:tcPr>
+          <w:p>
+            <w:r>
+              <w:rPr>
+                <w:rFonts w:ascii="Arial" w:cs="Arial" w:eastAsia="Arial" w:hAnsi="Arial"/>
+                <w:color w:val="000000"/>
+                <w:sz w:val="20"/>
+                <w:szCs w:val="20"/>
+              </w:rPr>
+              <w:t xml:space="preserve">They overcame something specific</w:t>
+            </w:r>
+          </w:p>
+        </w:tc>
+        <w:tc>
+          <w:tcPr>
+            <w:tcW w:type="dxa" w:w="3480"/>
+            <w:tcBorders>
+              <w:top w:val="single" w:color="CCCCCC" w:sz="1"/>
+              <w:left w:val="single" w:color="CCCCCC" w:sz="1"/>
+              <w:bottom w:val="single" w:color="CCCCCC" w:sz="1"/>
+              <w:right w:val="single" w:color="CCCCCC" w:sz="1"/>
+            </w:tcBorders>
+            <w:tcMar>
+              <w:top w:type="dxa" w:w="80"/>
+              <w:left w:type="dxa" w:w="120"/>
+              <w:bottom w:type="dxa" w:w="80"/>
+              <w:right w:type="dxa" w:w="120"/>
+            </w:tcMar>
+          </w:tcPr>
+          <w:p>
+            <w:r>
+              <w:rPr>
+                <w:rFonts w:ascii="Arial" w:cs="Arial" w:eastAsia="Arial" w:hAnsi="Arial"/>
+                <w:i/>
+                <w:iCs/>
+                <w:color w:val="000000"/>
+                <w:sz w:val="20"/>
+                <w:szCs w:val="20"/>
+              </w:rPr>
+              <w:t xml:space="preserve">“The one who used to be scared of the deep end.”</w:t>
+            </w:r>
+          </w:p>
+        </w:tc>
+      </w:tr>
+      <w:tr>
+        <w:tc>
+          <w:tcPr>
+            <w:tcW w:type="dxa" w:w="3120"/>
+            <w:tcBorders>
+              <w:top w:val="single" w:color="CCCCCC" w:sz="1"/>
+              <w:left w:val="single" w:color="CCCCCC" w:sz="1"/>
+              <w:bottom w:val="single" w:color="CCCCCC" w:sz="1"/>
+              <w:right w:val="single" w:color="CCCCCC" w:sz="1"/>
+            </w:tcBorders>
+            <w:tcMar>
+              <w:top w:type="dxa" w:w="80"/>
+              <w:left w:type="dxa" w:w="120"/>
+              <w:bottom w:type="dxa" w:w="80"/>
+              <w:right w:type="dxa" w:w="120"/>
+            </w:tcMar>
+          </w:tcPr>
+          <w:p>
+            <w:r>
+              <w:rPr>
+                <w:rFonts w:ascii="Arial" w:cs="Arial" w:eastAsia="Arial" w:hAnsi="Arial"/>
+                <w:b/>
+                <w:bCs/>
+                <w:color w:val="000000"/>
+                <w:sz w:val="20"/>
+                <w:szCs w:val="20"/>
+              </w:rPr>
+              <w:t xml:space="preserve">“[Time] ago, [limitation]. Now [achievement].”</w:t>
+            </w:r>
+          </w:p>
+        </w:tc>
+        <w:tc>
+          <w:tcPr>
+            <w:tcW w:type="dxa" w:w="2760"/>
+            <w:tcBorders>
+              <w:top w:val="single" w:color="CCCCCC" w:sz="1"/>
+              <w:left w:val="single" w:color="CCCCCC" w:sz="1"/>
+              <w:bottom w:val="single" w:color="CCCCCC" w:sz="1"/>
+              <w:right w:val="single" w:color="CCCCCC" w:sz="1"/>
+            </w:tcBorders>
+            <w:tcMar>
+              <w:top w:type="dxa" w:w="80"/>
+              <w:left w:type="dxa" w:w="120"/>
+              <w:bottom w:type="dxa" w:w="80"/>
+              <w:right w:type="dxa" w:w="120"/>
+            </w:tcMar>
+          </w:tcPr>
+          <w:p>
+            <w:r>
+              <w:rPr>
+                <w:rFonts w:ascii="Arial" w:cs="Arial" w:eastAsia="Arial" w:hAnsi="Arial"/>
+                <w:color w:val="000000"/>
+                <w:sz w:val="20"/>
+                <w:szCs w:val="20"/>
+              </w:rPr>
+              <w:t xml:space="preserve">Clear before/after transformation</w:t>
+            </w:r>
+          </w:p>
+        </w:tc>
+        <w:tc>
+          <w:tcPr>
+            <w:tcW w:type="dxa" w:w="3480"/>
+            <w:tcBorders>
+              <w:top w:val="single" w:color="CCCCCC" w:sz="1"/>
+              <w:left w:val="single" w:color="CCCCCC" w:sz="1"/>
+              <w:bottom w:val="single" w:color="CCCCCC" w:sz="1"/>
+              <w:right w:val="single" w:color="CCCCCC" w:sz="1"/>
+            </w:tcBorders>
+            <w:tcMar>
+              <w:top w:type="dxa" w:w="80"/>
+              <w:left w:type="dxa" w:w="120"/>
+              <w:bottom w:type="dxa" w:w="80"/>
+              <w:right w:type="dxa" w:w="120"/>
+            </w:tcMar>
+          </w:tcPr>
+          <w:p>
+            <w:r>
+              <w:rPr>
+                <w:rFonts w:ascii="Arial" w:cs="Arial" w:eastAsia="Arial" w:hAnsi="Arial"/>
+                <w:i/>
+                <w:iCs/>
+                <w:color w:val="000000"/>
+                <w:sz w:val="20"/>
+                <w:szCs w:val="20"/>
+              </w:rPr>
+              <w:t xml:space="preserve">“6 months ago, couldn’t float. Now swimming full laps.”</w:t>
+            </w:r>
+          </w:p>
+        </w:tc>
+      </w:tr>
+      <w:tr>
+        <w:tc>
+          <w:tcPr>
+            <w:tcW w:type="dxa" w:w="3120"/>
+            <w:tcBorders>
+              <w:top w:val="single" w:color="CCCCCC" w:sz="1"/>
+              <w:left w:val="single" w:color="CCCCCC" w:sz="1"/>
+              <w:bottom w:val="single" w:color="CCCCCC" w:sz="1"/>
+              <w:right w:val="single" w:color="CCCCCC" w:sz="1"/>
+            </w:tcBorders>
+            <w:tcMar>
+              <w:top w:type="dxa" w:w="80"/>
+              <w:left w:type="dxa" w:w="120"/>
+              <w:bottom w:type="dxa" w:w="80"/>
+              <w:right w:type="dxa" w:w="120"/>
+            </w:tcMar>
+          </w:tcPr>
+          <w:p>
+            <w:r>
+              <w:rPr>
+                <w:rFonts w:ascii="Arial" w:cs="Arial" w:eastAsia="Arial" w:hAnsi="Arial"/>
+                <w:b/>
+                <w:bCs/>
+                <w:color w:val="000000"/>
+                <w:sz w:val="20"/>
+                <w:szCs w:val="20"/>
+              </w:rPr>
+              <w:t xml:space="preserve">“From [start] to [now].”</w:t>
+            </w:r>
+          </w:p>
+        </w:tc>
+        <w:tc>
+          <w:tcPr>
+            <w:tcW w:type="dxa" w:w="2760"/>
+            <w:tcBorders>
+              <w:top w:val="single" w:color="CCCCCC" w:sz="1"/>
+              <w:left w:val="single" w:color="CCCCCC" w:sz="1"/>
+              <w:bottom w:val="single" w:color="CCCCCC" w:sz="1"/>
+              <w:right w:val="single" w:color="CCCCCC" w:sz="1"/>
+            </w:tcBorders>
+            <w:tcMar>
+              <w:top w:type="dxa" w:w="80"/>
+              <w:left w:type="dxa" w:w="120"/>
+              <w:bottom w:type="dxa" w:w="80"/>
+              <w:right w:type="dxa" w:w="120"/>
+            </w:tcMar>
+          </w:tcPr>
+          <w:p>
+            <w:r>
+              <w:rPr>
+                <w:rFonts w:ascii="Arial" w:cs="Arial" w:eastAsia="Arial" w:hAnsi="Arial"/>
+                <w:color w:val="000000"/>
+                <w:sz w:val="20"/>
+                <w:szCs w:val="20"/>
+              </w:rPr>
+              <w:t xml:space="preserve">Quick-read journey framing</w:t>
+            </w:r>
+          </w:p>
+        </w:tc>
+        <w:tc>
+          <w:tcPr>
+            <w:tcW w:type="dxa" w:w="3480"/>
+            <w:tcBorders>
+              <w:top w:val="single" w:color="CCCCCC" w:sz="1"/>
+              <w:left w:val="single" w:color="CCCCCC" w:sz="1"/>
+              <w:bottom w:val="single" w:color="CCCCCC" w:sz="1"/>
+              <w:right w:val="single" w:color="CCCCCC" w:sz="1"/>
+            </w:tcBorders>
+            <w:tcMar>
+              <w:top w:type="dxa" w:w="80"/>
+              <w:left w:type="dxa" w:w="120"/>
+              <w:bottom w:type="dxa" w:w="80"/>
+              <w:right w:type="dxa" w:w="120"/>
+            </w:tcMar>
+          </w:tcPr>
+          <w:p>
+            <w:r>
+              <w:rPr>
+                <w:rFonts w:ascii="Arial" w:cs="Arial" w:eastAsia="Arial" w:hAnsi="Arial"/>
+                <w:i/>
+                <w:iCs/>
+                <w:color w:val="000000"/>
+                <w:sz w:val="20"/>
+                <w:szCs w:val="20"/>
+              </w:rPr>
+              <w:t xml:space="preserve">“From ‘I’ll drown’ to ‘race me’.”</w:t>
+            </w:r>
+          </w:p>
+        </w:tc>
+      </w:tr>
+      <w:tr>
+        <w:tc>
+          <w:tcPr>
+            <w:tcW w:type="dxa" w:w="3120"/>
+            <w:tcBorders>
+              <w:top w:val="single" w:color="CCCCCC" w:sz="1"/>
+              <w:left w:val="single" w:color="CCCCCC" w:sz="1"/>
+              <w:bottom w:val="single" w:color="CCCCCC" w:sz="1"/>
+              <w:right w:val="single" w:color="CCCCCC" w:sz="1"/>
+            </w:tcBorders>
+            <w:tcMar>
+              <w:top w:type="dxa" w:w="80"/>
+              <w:left w:type="dxa" w:w="120"/>
+              <w:bottom w:type="dxa" w:w="80"/>
+              <w:right w:type="dxa" w:w="120"/>
+            </w:tcMar>
+          </w:tcPr>
+          <w:p>
+            <w:r>
+              <w:rPr>
+                <w:rFonts w:ascii="Arial" w:cs="Arial" w:eastAsia="Arial" w:hAnsi="Arial"/>
+                <w:b/>
+                <w:bCs/>
+                <w:color w:val="000000"/>
+                <w:sz w:val="20"/>
+                <w:szCs w:val="20"/>
+              </w:rPr>
+              <w:t xml:space="preserve">“The [unexpected identity or role]”</w:t>
+            </w:r>
+          </w:p>
+        </w:tc>
+        <w:tc>
+          <w:tcPr>
+            <w:tcW w:type="dxa" w:w="2760"/>
+            <w:tcBorders>
+              <w:top w:val="single" w:color="CCCCCC" w:sz="1"/>
+              <w:left w:val="single" w:color="CCCCCC" w:sz="1"/>
+              <w:bottom w:val="single" w:color="CCCCCC" w:sz="1"/>
+              <w:right w:val="single" w:color="CCCCCC" w:sz="1"/>
+            </w:tcBorders>
+            <w:tcMar>
+              <w:top w:type="dxa" w:w="80"/>
+              <w:left w:type="dxa" w:w="120"/>
+              <w:bottom w:type="dxa" w:w="80"/>
+              <w:right w:type="dxa" w:w="120"/>
+            </w:tcMar>
+          </w:tcPr>
+          <w:p>
+            <w:r>
+              <w:rPr>
+                <w:rFonts w:ascii="Arial" w:cs="Arial" w:eastAsia="Arial" w:hAnsi="Arial"/>
+                <w:color w:val="000000"/>
+                <w:sz w:val="20"/>
+                <w:szCs w:val="20"/>
+              </w:rPr>
+              <w:t xml:space="preserve">Surprise or contrast angle</w:t>
+            </w:r>
+          </w:p>
+        </w:tc>
+        <w:tc>
+          <w:tcPr>
+            <w:tcW w:type="dxa" w:w="3480"/>
+            <w:tcBorders>
+              <w:top w:val="single" w:color="CCCCCC" w:sz="1"/>
+              <w:left w:val="single" w:color="CCCCCC" w:sz="1"/>
+              <w:bottom w:val="single" w:color="CCCCCC" w:sz="1"/>
+              <w:right w:val="single" w:color="CCCCCC" w:sz="1"/>
+            </w:tcBorders>
+            <w:tcMar>
+              <w:top w:type="dxa" w:w="80"/>
+              <w:left w:type="dxa" w:w="120"/>
+              <w:bottom w:type="dxa" w:w="80"/>
+              <w:right w:type="dxa" w:w="120"/>
+            </w:tcMar>
+          </w:tcPr>
+          <w:p>
+            <w:r>
+              <w:rPr>
+                <w:rFonts w:ascii="Arial" w:cs="Arial" w:eastAsia="Arial" w:hAnsi="Arial"/>
+                <w:i/>
+                <w:iCs/>
+                <w:color w:val="000000"/>
+                <w:sz w:val="20"/>
+                <w:szCs w:val="20"/>
+              </w:rPr>
+              <w:t xml:space="preserve">“The product designer who codes better underwater.”</w:t>
+            </w:r>
+          </w:p>
+        </w:tc>
+      </w:tr>
+      <w:tr>
+        <w:tc>
+          <w:tcPr>
+            <w:tcW w:type="dxa" w:w="3120"/>
+            <w:tcBorders>
+              <w:top w:val="single" w:color="CCCCCC" w:sz="1"/>
+              <w:left w:val="single" w:color="CCCCCC" w:sz="1"/>
+              <w:bottom w:val="single" w:color="CCCCCC" w:sz="1"/>
+              <w:right w:val="single" w:color="CCCCCC" w:sz="1"/>
+            </w:tcBorders>
+            <w:tcMar>
+              <w:top w:type="dxa" w:w="80"/>
+              <w:left w:type="dxa" w:w="120"/>
+              <w:bottom w:type="dxa" w:w="80"/>
+              <w:right w:type="dxa" w:w="120"/>
+            </w:tcMar>
+          </w:tcPr>
+          <w:p>
+            <w:r>
+              <w:rPr>
+                <w:rFonts w:ascii="Arial" w:cs="Arial" w:eastAsia="Arial" w:hAnsi="Arial"/>
+                <w:b/>
+                <w:bCs/>
+                <w:color w:val="000000"/>
+                <w:sz w:val="20"/>
+                <w:szCs w:val="20"/>
+              </w:rPr>
+              <w:t xml:space="preserve">“[Their thing] — on a [day or time].”</w:t>
+            </w:r>
+          </w:p>
+        </w:tc>
+        <w:tc>
+          <w:tcPr>
+            <w:tcW w:type="dxa" w:w="2760"/>
+            <w:tcBorders>
+              <w:top w:val="single" w:color="CCCCCC" w:sz="1"/>
+              <w:left w:val="single" w:color="CCCCCC" w:sz="1"/>
+              <w:bottom w:val="single" w:color="CCCCCC" w:sz="1"/>
+              <w:right w:val="single" w:color="CCCCCC" w:sz="1"/>
+            </w:tcBorders>
+            <w:tcMar>
+              <w:top w:type="dxa" w:w="80"/>
+              <w:left w:type="dxa" w:w="120"/>
+              <w:bottom w:type="dxa" w:w="80"/>
+              <w:right w:type="dxa" w:w="120"/>
+            </w:tcMar>
+          </w:tcPr>
+          <w:p>
+            <w:r>
+              <w:rPr>
+                <w:rFonts w:ascii="Arial" w:cs="Arial" w:eastAsia="Arial" w:hAnsi="Arial"/>
+                <w:color w:val="000000"/>
+                <w:sz w:val="20"/>
+                <w:szCs w:val="20"/>
+              </w:rPr>
+              <w:t xml:space="preserve">Lifestyle / community angle</w:t>
+            </w:r>
+          </w:p>
+        </w:tc>
+        <w:tc>
+          <w:tcPr>
+            <w:tcW w:type="dxa" w:w="3480"/>
+            <w:tcBorders>
+              <w:top w:val="single" w:color="CCCCCC" w:sz="1"/>
+              <w:left w:val="single" w:color="CCCCCC" w:sz="1"/>
+              <w:bottom w:val="single" w:color="CCCCCC" w:sz="1"/>
+              <w:right w:val="single" w:color="CCCCCC" w:sz="1"/>
+            </w:tcBorders>
+            <w:tcMar>
+              <w:top w:type="dxa" w:w="80"/>
+              <w:left w:type="dxa" w:w="120"/>
+              <w:bottom w:type="dxa" w:w="80"/>
+              <w:right w:type="dxa" w:w="120"/>
+            </w:tcMar>
+          </w:tcPr>
+          <w:p>
+            <w:r>
+              <w:rPr>
+                <w:rFonts w:ascii="Arial" w:cs="Arial" w:eastAsia="Arial" w:hAnsi="Arial"/>
+                <w:i/>
+                <w:iCs/>
+                <w:color w:val="000000"/>
+                <w:sz w:val="20"/>
+                <w:szCs w:val="20"/>
+              </w:rPr>
+              <w:t xml:space="preserve">“The 5am crew. Every Saturday. No excuses.”</w:t>
+            </w:r>
+          </w:p>
+        </w:tc>
+      </w:tr>
+      <w:tr>
+        <w:tc>
+          <w:tcPr>
+            <w:tcW w:type="dxa" w:w="3120"/>
+            <w:tcBorders>
+              <w:top w:val="single" w:color="CCCCCC" w:sz="1"/>
+              <w:left w:val="single" w:color="CCCCCC" w:sz="1"/>
+              <w:bottom w:val="single" w:color="CCCCCC" w:sz="1"/>
+              <w:right w:val="single" w:color="CCCCCC" w:sz="1"/>
+            </w:tcBorders>
+            <w:tcMar>
+              <w:top w:type="dxa" w:w="80"/>
+              <w:left w:type="dxa" w:w="120"/>
+              <w:bottom w:type="dxa" w:w="80"/>
+              <w:right w:type="dxa" w:w="120"/>
+            </w:tcMar>
+          </w:tcPr>
+          <w:p>
+            <w:r>
+              <w:rPr>
+                <w:rFonts w:ascii="Arial" w:cs="Arial" w:eastAsia="Arial" w:hAnsi="Arial"/>
+                <w:b/>
+                <w:bCs/>
+                <w:color w:val="000000"/>
+                <w:sz w:val="20"/>
+                <w:szCs w:val="20"/>
+              </w:rPr>
+              <w:t xml:space="preserve">Their own words, verbatim</w:t>
+            </w:r>
+          </w:p>
+        </w:tc>
+        <w:tc>
+          <w:tcPr>
+            <w:tcW w:type="dxa" w:w="2760"/>
+            <w:tcBorders>
+              <w:top w:val="single" w:color="CCCCCC" w:sz="1"/>
+              <w:left w:val="single" w:color="CCCCCC" w:sz="1"/>
+              <w:bottom w:val="single" w:color="CCCCCC" w:sz="1"/>
+              <w:right w:val="single" w:color="CCCCCC" w:sz="1"/>
+            </w:tcBorders>
+            <w:tcMar>
+              <w:top w:type="dxa" w:w="80"/>
+              <w:left w:type="dxa" w:w="120"/>
+              <w:bottom w:type="dxa" w:w="80"/>
+              <w:right w:type="dxa" w:w="120"/>
+            </w:tcMar>
+          </w:tcPr>
+          <w:p>
+            <w:r>
+              <w:rPr>
+                <w:rFonts w:ascii="Arial" w:cs="Arial" w:eastAsia="Arial" w:hAnsi="Arial"/>
+                <w:color w:val="000000"/>
+                <w:sz w:val="20"/>
+                <w:szCs w:val="20"/>
+              </w:rPr>
+              <w:t xml:space="preserve">When a member said something better than you could write</w:t>
+            </w:r>
+          </w:p>
+        </w:tc>
+        <w:tc>
+          <w:tcPr>
+            <w:tcW w:type="dxa" w:w="3480"/>
+            <w:tcBorders>
+              <w:top w:val="single" w:color="CCCCCC" w:sz="1"/>
+              <w:left w:val="single" w:color="CCCCCC" w:sz="1"/>
+              <w:bottom w:val="single" w:color="CCCCCC" w:sz="1"/>
+              <w:right w:val="single" w:color="CCCCCC" w:sz="1"/>
+            </w:tcBorders>
+            <w:tcMar>
+              <w:top w:type="dxa" w:w="80"/>
+              <w:left w:type="dxa" w:w="120"/>
+              <w:bottom w:type="dxa" w:w="80"/>
+              <w:right w:type="dxa" w:w="120"/>
+            </w:tcMar>
+          </w:tcPr>
+          <w:p>
+            <w:r>
+              <w:rPr>
+                <w:rFonts w:ascii="Arial" w:cs="Arial" w:eastAsia="Arial" w:hAnsi="Arial"/>
+                <w:i/>
+                <w:iCs/>
+                <w:color w:val="000000"/>
+                <w:sz w:val="20"/>
+                <w:szCs w:val="20"/>
+              </w:rPr>
+              <w:t xml:space="preserve">“‘I didn’t know water could feel like home.’”</w:t>
+            </w:r>
+          </w:p>
+        </w:tc>
+      </w:tr>
+    </w:tbl>
+    <w:p>
+      <w:pPr>
+        <w:spacing w:after="80"/>
+      </w:pPr>
+    </w:p>
+    <w:p>
+      <w:pPr>
+        <w:spacing w:after="120"/>
+      </w:pPr>
+      <w:r>
+        <w:rPr>
+          <w:rFonts w:ascii="Arial" w:cs="Arial" w:eastAsia="Arial" w:hAnsi="Arial"/>
+          <w:b/>
+          <w:bCs/>
+          <w:sz w:val="22"/>
+          <w:szCs w:val="22"/>
+        </w:rPr>
+        <w:t xml:space="preserve">How to write one in 10 minutes</w:t>
+      </w:r>
+    </w:p>
+    <w:p>
+      <w:pPr>
+        <w:pStyle w:val="ListParagraph"/>
+        <w:numPr>
+          <w:ilvl w:val="0"/>
+          <w:numId w:val="2"/>
+        </w:numPr>
+      </w:pPr>
+      <w:r>
+        <w:rPr>
+          <w:rFonts w:ascii="Arial" w:cs="Arial" w:eastAsia="Arial" w:hAnsi="Arial"/>
+          <w:sz w:val="22"/>
+          <w:szCs w:val="22"/>
+        </w:rPr>
+        <w:t xml:space="preserve">Open the weekly Member Spotlight in the Content WhatsApp group.</w:t>
+      </w:r>
+    </w:p>
+    <w:p>
+      <w:pPr>
+        <w:pStyle w:val="ListParagraph"/>
+        <w:numPr>
+          <w:ilvl w:val="0"/>
+          <w:numId w:val="2"/>
+        </w:numPr>
+      </w:pPr>
+      <w:r>
+        <w:rPr>
+          <w:rFonts w:ascii="Arial" w:cs="Arial" w:eastAsia="Arial" w:hAnsi="Arial"/>
+          <w:sz w:val="22"/>
+          <w:szCs w:val="22"/>
+        </w:rPr>
+        <w:t xml:space="preserve">Highlight the 1–2 most distinctive facts — what would make a stranger say “oh, interesting”?</w:t>
+      </w:r>
+    </w:p>
+    <w:p>
+      <w:pPr>
+        <w:pStyle w:val="ListParagraph"/>
+        <w:numPr>
+          <w:ilvl w:val="0"/>
+          <w:numId w:val="2"/>
+        </w:numPr>
+      </w:pPr>
+      <w:r>
+        <w:rPr>
+          <w:rFonts w:ascii="Arial" w:cs="Arial" w:eastAsia="Arial" w:hAnsi="Arial"/>
+          <w:sz w:val="22"/>
+          <w:szCs w:val="22"/>
+        </w:rPr>
+        <w:t xml:space="preserve">Run them through the formulas above. Usually one fits naturally — don’t force it.</w:t>
+      </w:r>
+    </w:p>
+    <w:p>
+      <w:pPr>
+        <w:pStyle w:val="ListParagraph"/>
+        <w:numPr>
+          <w:ilvl w:val="0"/>
+          <w:numId w:val="2"/>
+        </w:numPr>
+      </w:pPr>
+      <w:r>
+        <w:rPr>
+          <w:rFonts w:ascii="Arial" w:cs="Arial" w:eastAsia="Arial" w:hAnsi="Arial"/>
+          <w:sz w:val="22"/>
+          <w:szCs w:val="22"/>
+        </w:rPr>
+        <w:t xml:space="preserve">Write 2–3 versions. Pick the shortest and most specific.</w:t>
+      </w:r>
+    </w:p>
+    <w:p>
+      <w:pPr>
+        <w:pStyle w:val="ListParagraph"/>
+        <w:numPr>
+          <w:ilvl w:val="0"/>
+          <w:numId w:val="2"/>
+        </w:numPr>
+      </w:pPr>
+      <w:r>
+        <w:rPr>
+          <w:rFonts w:ascii="Arial" w:cs="Arial" w:eastAsia="Arial" w:hAnsi="Arial"/>
+          <w:sz w:val="22"/>
+          <w:szCs w:val="22"/>
+        </w:rPr>
+        <w:t xml:space="preserve">Stuck? DM the member with one prompt (“What’s the one thing you’d tell someone scared to start?”) and use their answer verbatim.</w:t>
+      </w:r>
+    </w:p>
+    <w:p>
+      <w:pPr>
+        <w:spacing w:after="80"/>
+      </w:pPr>
+    </w:p>
+    <w:p>
+      <w:pPr>
+        <w:spacing w:after="120"/>
+      </w:pPr>
+      <w:r>
+        <w:rPr>
+          <w:rFonts w:ascii="Arial" w:cs="Arial" w:eastAsia="Arial" w:hAnsi="Arial"/>
+          <w:i/>
+          <w:iCs/>
+          <w:color w:val="1A73E8"/>
+          <w:sz w:val="22"/>
+          <w:szCs w:val="22"/>
+        </w:rPr>
+        <w:t xml:space="preserve">Pro tip: Specificity beats cleverness. “The one who used to be scared of the deep end” works because it’s concrete. If your draft could apply to any member, rewrite it.</w:t>
+      </w:r>
+    </w:p>
     <w:p>
       <w:pPr>
         <w:spacing w:after="80"/>

</xml_diff>

<commit_message>
docs: marketing collateral, corporate-pitch toolkit, sunscreen + shadow studies
Bundle of in-progress reference docs:

  - docs/community/SUNSCREEN_GUIDE.md — member-facing sunscreen
    recommendations for outdoor-pool sessions.
  - docs/strategy/SHADOW_STUDIES.md — coach-shadowing programme outline.
  - docs/marketing/COHORT_ENROLLMENT_OUTREACH_LIST.csv,
    docs/marketing/CONTENT_CREATOR_SCHEDULE.csv — operational lists for
    enrollment outreach and the content-creator rota.
  - docs/marketing/CORPORATE_WELLNESS.md — refreshed B2B wellness pitch.
  - docs/marketing/corporate_pitch/ — full corporate-pitch toolkit:
    cover-message templates, source markdown, generated PDF, and the
    build script (build_pitch_pdf.py) that produces the PDF from
    PITCH_SOURCE.md.
  - Minor revs to swimbuddz_content_calendar.xlsx,
    swimbuddz_content_templates.docx, swimbuddz_social_media_playbook.docx.

Co-Authored-By: Claude Opus 4.7 (1M context) <noreply@anthropic.com>
</commit_message>
<xml_diff>
--- a/docs/marketing/swimbuddz_content_templates.docx
+++ b/docs/marketing/swimbuddz_content_templates.docx
@@ -798,7 +798,7 @@
                 <w:sz w:val="20"/>
                 <w:szCs w:val="20"/>
               </w:rPr>
-              <w:t xml:space="preserve">"Nigeria's first swimming community" / "Water is Home"</w:t>
+              <w:t xml:space="preserve">"the global swimming community starting in Lagos" / "Water is Home"</w:t>
             </w:r>
           </w:p>
         </w:tc>
@@ -11376,7 +11376,7 @@
           <w:sz w:val="22"/>
           <w:szCs w:val="22"/>
         </w:rPr>
-        <w:t xml:space="preserve">Bio: "Nigeria's first swimming community. Learn. Train. Belong. 🏊" + link to swimbuddz.com</w:t>
+        <w:t xml:space="preserve">Bio: "the global swimming community starting in Lagos. Learn. Train. Belong. 🏊" + link to swimbuddz.com</w:t>
       </w:r>
     </w:p>
     <w:p>
@@ -11473,7 +11473,7 @@
           <w:sz w:val="22"/>
           <w:szCs w:val="22"/>
         </w:rPr>
-        <w:t xml:space="preserve">Bio: "Nigeria's first swimming community 🏊 Watch adults learn to swim" + link</w:t>
+        <w:t xml:space="preserve">Bio: "the global swimming community starting in Lagos 🏊 Watch adults learn to swim" + link</w:t>
       </w:r>
     </w:p>
     <w:p>

</xml_diff>